<commit_message>
Refocus PT SOP on Word content only, no materia prima
Rebuild interactive manual with same 9-tab layout as the logistics
dashboard. Word SOP phases I-VII and attribution matrix; PT and
equipamiento only.

Co-authored-by: scm-svg <scm-svg@users.noreply.github.com>
</commit_message>
<xml_diff>
--- a/SOP_Supervisor_Producto_Terminado_Manufacturado_Equipamiento.docx
+++ b/SOP_Supervisor_Producto_Terminado_Manufacturado_Equipamiento.docx
@@ -17,7 +17,7 @@
     </w:p>
     <w:p>
       <w:r>
-        <w:t>Título: Procedimiento Operativo de Supervisión de Producto Terminado — Manufacturado y Equipamiento</w:t>
+        <w:t>Título: Procedimiento Operativo de Reabastecimiento, Picking Unitario, Control de SKUs, Despacho a Tiendas y Gestión Cíclica de Inventarios — Producto Terminado (Manufacturado y Equipamiento)</w:t>
       </w:r>
     </w:p>
     <w:p>
@@ -32,7 +32,7 @@
     </w:p>
     <w:p>
       <w:r>
-        <w:t>Ámbito de Aplicación: Taller / Planta de Manufactura, ubicaciones de Producto Terminado (PT), acopio de equipamiento y coordinación con Logística (Materia Prima) e Inventarios para validación e ingreso en Odoo.</w:t>
+        <w:t>Ámbito de Aplicación: Almacén de Producto Terminado en Taller (prendas manufacturadas y equipamiento), desde ubicación de acopio PT hasta control de inventario, embalaje y despacho a Operaciones / tiendas.</w:t>
       </w:r>
     </w:p>
     <w:p>
@@ -45,7 +45,7 @@
     </w:p>
     <w:p>
       <w:r>
-        <w:t>Establecer la metodología operativa y de control supervisorio para la gestión integral del Producto Terminado (prendas manufacturadas y equipamiento), desde la recepción de Materia Prima en piso hasta la validación de órdenes de manufactura (OT), ingreso a ubicación teórica en Odoo, control de calidad en etapa de Validación, y coordinación con Logística e Inventarios para garantizar trazabilidad SKU a SKU y disponibilidad para despacho a tiendas.</w:t>
+        <w:t>Establecer la metodología operativa y de control supervisorio para la gestión integral de reabastecimiento a tiendas con producto terminado (manufacturado y equipamiento), ejecución de picking unitario, verificación de SKUs en Odoo, embalaje, despacho a Operaciones, así como el control semanal de inventarios cíclicos, conciliación de reservas y optimización física/lógica de los espacios del almacén PT.</w:t>
       </w:r>
     </w:p>
     <w:p>
@@ -58,7 +58,7 @@
     </w:p>
     <w:p>
       <w:r>
-        <w:t>Este manual norma las funciones, controles y actividades del Supervisor de Producto Terminado (Manufacturado &amp; Equipamiento). Abarca: (a) supervisión del flujo de MP en piso de manufactura y su reflejo en Odoo; (b) auditoría previa a la etapa de Validación de manufactura; (c) aprobación de consumo de MP e ingreso de PT; (d) gestión de ubicaciones teóricas y layout de PT/equipamiento; (e) coordinación con Supervisión de Logística e Inventarios para reabastecimiento y despacho. No sustituye los SOP de Materia Prima, Consumibles ni Requisición de Compra, pero define los puntos de interfaz obligatorios con Producto Terminado.</w:t>
+        <w:t>Este manual norma de manera exclusiva las funciones, controles y actividades asignadas a la Supervisión de Producto Terminado (Manufacturado &amp; Equipamiento). Abarca desde la recepción de solicitudes de tienda hasta el despacho final a Operaciones, sumando la gobernanza semanal del layout, ubicaciones y saldos de inventario de producto terminado en el almacén central. No incluye procesos de materia prima, compras de tela ni manufactura en planta.</w:t>
       </w:r>
     </w:p>
     <w:p>
@@ -66,12 +66,7 @@
         <w:pStyle w:val="Heading2"/>
       </w:pPr>
       <w:r>
-        <w:t>3. MARCO DE REFERENCIA — MAPA DE PROCESOS (Somos Cuadro)</w:t>
-      </w:r>
-    </w:p>
-    <w:p>
-      <w:r>
-        <w:t>El Supervisor de PT opera en la cadena que conecta Requisición de Compra → Recepción (QA) → Despacho MP → Manufactura → Validación PT → Inventario teórico → Despacho a tiendas. Referencia: Manual de Procesos Logística e Inventarios (dashboard operativo).</w:t>
+        <w:t>3. PROCEDIMIENTO DETALLADO PASO A PASO</w:t>
       </w:r>
     </w:p>
     <w:p>
@@ -79,39 +74,270 @@
         <w:pStyle w:val="Heading3"/>
       </w:pPr>
       <w:r>
-        <w:t>Interfases críticas con Logística</w:t>
+        <w:t>FASE I: Solicitud, Verificación de Fichas Técnicas e Impresión</w:t>
+      </w:r>
+    </w:p>
+    <w:p>
+      <w:r>
+        <w:t>Registro de Solicitud: La red de tiendas genera sus requerimientos de reposición mediante la matriz oficial en Google Sheets.</w:t>
+      </w:r>
+    </w:p>
+    <w:p>
+      <w:r>
+        <w:t>Validación de Variantes y SKUs en Sistema (Odoo y Web):</w:t>
+      </w:r>
+    </w:p>
+    <w:p>
+      <w:r>
+        <w:t>El supervisor valida que los ítems solicitados correspondan a las variantes reales en Odoo y la tienda web (somoscuadro.com), tanto en líneas manufacturadas como en equipamiento.</w:t>
+      </w:r>
+    </w:p>
+    <w:p>
+      <w:r>
+        <w:t>Control Preventivo: Si se solicitan piezas o variantes no existentes (por ejemplo, Short Basic Lines en color gris), el supervisor frena la orden y la corrige de inmediato, dado que la marca produce y comercializa dicha prenda únicamente en Negro y Marrón.</w:t>
+      </w:r>
+    </w:p>
+    <w:p>
+      <w:r>
+        <w:t>Emisión de Listas de Picking: Se imprimen las listas de recolección para el equipo de almacenistas. (Migración planificada: Implementación de tablets/dispositivos móviles).</w:t>
       </w:r>
     </w:p>
     <w:p>
       <w:pPr>
-        <w:pStyle w:val="ListBullet"/>
+        <w:pStyle w:val="Heading3"/>
       </w:pPr>
       <w:r>
-        <w:t>Requisición de Compra: Compras aprueba en Odoo Aprobaciones; el PT no valida compras, pero depende de lead time y recepción oportuna.</w:t>
+        <w:t>FASE II: Priorización y Programación Logística de Despachos</w:t>
+      </w:r>
+    </w:p>
+    <w:p>
+      <w:r>
+        <w:t>La supervisión establece la prioridad de recolección en piso considerando ventanas administrativas y de transporte:</w:t>
+      </w:r>
+    </w:p>
+    <w:p>
+      <w:r>
+        <w:t>Prioridad 1: CC El Tolón y Grand Plaz (Caracas)</w:t>
+      </w:r>
+    </w:p>
+    <w:p>
+      <w:r>
+        <w:t>Condición Operativa: Grand Plaz posee espacio reducido y no cuenta con depósito propio, compartiendo almacenamiento con la sede del CC El Tolón.</w:t>
+      </w:r>
+    </w:p>
+    <w:p>
+      <w:r>
+        <w:t>Requisito de Seguridad CC: La administración del CC El Tolón exige la notificación exacta del número de cajas con un (1) día de anticipación. Se prioriza el armado y conteo de estas unidades a primera hora.</w:t>
+      </w:r>
+    </w:p>
+    <w:p>
+      <w:r>
+        <w:t>Prioridad 2: Ruta Valencia (Sambil Valencia y CC La Grieta)</w:t>
+      </w:r>
+    </w:p>
+    <w:p>
+      <w:r>
+        <w:t>Cronograma Semanal: El despacho físico a Valencia se ejecuta formalmente los días martes.</w:t>
+      </w:r>
+    </w:p>
+    <w:p>
+      <w:r>
+        <w:t>Sambil Valencia: Requiere preparación urgente para cumplir con la ventana de recepción exclusiva del centro comercial en horario matutino (hasta las 10:00 a.m.).</w:t>
+      </w:r>
+    </w:p>
+    <w:p>
+      <w:r>
+        <w:t>Prioridad 3: Consolidación del Resto de la Red Nacional</w:t>
+      </w:r>
+    </w:p>
+    <w:p>
+      <w:r>
+        <w:t>Se completa el surtido para las demás sucursales entre lunes y martes a primera hora, garantizando que ninguna tienda quede desabastecida.</w:t>
       </w:r>
     </w:p>
     <w:p>
       <w:pPr>
-        <w:pStyle w:val="ListBullet"/>
+        <w:pStyle w:val="Heading3"/>
       </w:pPr>
       <w:r>
-        <w:t>Recepción MP: QA revisa rollo/insumo; traslado TH/Por Auditar → Materia Prima debe estar confirmado antes de consumo en OT.</w:t>
+        <w:t>FASE III: Picking Unitario, Escaneo y Atajada de Discrepancias</w:t>
+      </w:r>
+    </w:p>
+    <w:p>
+      <w:r>
+        <w:t>Picking Unitario (1 a 1): El personal de piso recorre los pasillos del almacén PT ejecutando la recolección pieza por pieza (1 a 1) mediante lector de código de barras (pistola scanner) para evitar errores de conteo.</w:t>
+      </w:r>
+    </w:p>
+    <w:p>
+      <w:r>
+        <w:t>Verificación Supervisoria de SKUs:</w:t>
+      </w:r>
+    </w:p>
+    <w:p>
+      <w:r>
+        <w:t>Al culminar la recolección, el supervisor realiza el cruce final entre los SKUs recolectados físicamente y los saldos disponibles registrados en Odoo.</w:t>
+      </w:r>
+    </w:p>
+    <w:p>
+      <w:r>
+        <w:t>Esta verificación permite atajar y corregir discrepancias a tiempo antes del empaque definitivo.</w:t>
       </w:r>
     </w:p>
     <w:p>
       <w:pPr>
-        <w:pStyle w:val="ListBullet"/>
+        <w:pStyle w:val="Heading3"/>
       </w:pPr>
       <w:r>
-        <w:t>Despacho MP a Producción: Solicitud con OT + trazos Audaces; picking MP; registro Sheets + traslado Odoo (TH/Existencia MP → Preproducción).</w:t>
+        <w:t>FASE IV: Gestión de Contingencias ("Levantar la Bandera")</w:t>
+      </w:r>
+    </w:p>
+    <w:p>
+      <w:r>
+        <w:t>Protocolo de Alerta: Ante stock bajo o crítico detectado en anaquel durante el picking, el almacenista detiene la asignación y reporta la novedad al supervisor.</w:t>
+      </w:r>
+    </w:p>
+    <w:p>
+      <w:r>
+        <w:t>Resolución Supervisoria: El supervisor evalúa las existencias reales y dictamina estratégicamente hacia qué tienda dirigir el producto restante y por qué motivo, optimizando la cobertura de red.</w:t>
       </w:r>
     </w:p>
     <w:p>
       <w:pPr>
-        <w:pStyle w:val="ListBullet"/>
+        <w:pStyle w:val="Heading3"/>
       </w:pPr>
       <w:r>
-        <w:t>Validación manufactura: Descuento de tela en 1.ª etapa (traslado por ola); descuento de demás insumos en Validación con aprobación explícita de MP consumida.</w:t>
+        <w:t>FASE V: Estándares de Embalaje, Calidad y Condición de Viaje</w:t>
+      </w:r>
+    </w:p>
+    <w:p>
+      <w:r>
+        <w:t>La supervisión inspecciona que toda caja lista para despacho cumpla los criterios mínimos de calidad:</w:t>
+      </w:r>
+    </w:p>
+    <w:p>
+      <w:r>
+        <w:t>Protección Interna: Es obligatorio colocar una bolsa plástica separadora entre la prenda y la caja de cartón para prevenir roces, humedad o manchas durante el transporte.</w:t>
+      </w:r>
+    </w:p>
+    <w:p>
+      <w:r>
+        <w:t>Acondicionamiento Organizado: Toda prenda debe estar etiquetada y empaquetada de forma limpia para agilizar la recepción del almacenista en tienda.</w:t>
+      </w:r>
+    </w:p>
+    <w:p>
+      <w:r>
+        <w:t>Estructura y Ergonomía: Cajas selladas, no deformadas y con peso adecuado para manipulación manual segura.</w:t>
+      </w:r>
+    </w:p>
+    <w:p>
+      <w:r>
+        <w:t>Rotulado Exterior Obligatorio:</w:t>
+      </w:r>
+    </w:p>
+    <w:p>
+      <w:r>
+        <w:t>La caja debe llevar únicamente el hablador (etiqueta) de la tienda destino.</w:t>
+      </w:r>
+    </w:p>
+    <w:p>
+      <w:r>
+        <w:t>Debe figurar de manera clara y visible el código SENCAMER.</w:t>
+      </w:r>
+    </w:p>
+    <w:p>
+      <w:pPr>
+        <w:pStyle w:val="Heading3"/>
+      </w:pPr>
+      <w:r>
+        <w:t>FASE VI: Documentación, Notas de Entrega y Carga de Camión</w:t>
+      </w:r>
+    </w:p>
+    <w:p>
+      <w:r>
+        <w:t>Emisión de Notas de Entrega: Impresión de los documentos oficiales por tienda.</w:t>
+      </w:r>
+    </w:p>
+    <w:p>
+      <w:r>
+        <w:t>Verificación Transferencia por Transferencia: Verificación física cruzando transferencia por transferencia y tienda por tienda, adjuntando los soportes impresos correspondientes.</w:t>
+      </w:r>
+    </w:p>
+    <w:p>
+      <w:r>
+        <w:t>Conteo General y Consolidado: Conteo final del número total de cajas.</w:t>
+      </w:r>
+    </w:p>
+    <w:p>
+      <w:r>
+        <w:t>Traspaso a Operaciones: Entrega formal del lote y la carpeta documental al área de Operaciones.</w:t>
+      </w:r>
+    </w:p>
+    <w:p>
+      <w:r>
+        <w:t>Carga Anticipada: La carga del camión se realiza el día anterior al despacho para permitir la salida del transporte a primera hora de la mañana.</w:t>
+      </w:r>
+    </w:p>
+    <w:p>
+      <w:pPr>
+        <w:pStyle w:val="Heading3"/>
+      </w:pPr>
+      <w:r>
+        <w:t>FASE VII: Control Semanal: Inventario Cíclico, Conciliación Odoo y Layout</w:t>
+      </w:r>
+    </w:p>
+    <w:p>
+      <w:r>
+        <w:t>Como parte de las rutinas de control continuo, el supervisor ejecuta semanalmente las siguientes actividades de auditoría e infraestructura:</w:t>
+      </w:r>
+    </w:p>
+    <w:p>
+      <w:r>
+        <w:t>Ejecución y Conciliación del Inventario Cíclico:</w:t>
+      </w:r>
+    </w:p>
+    <w:p>
+      <w:r>
+        <w:t>Se coordina el conteo físico cíclico por familias o zonas del almacén PT (manufacturado y equipamiento).</w:t>
+      </w:r>
+    </w:p>
+    <w:p>
+      <w:r>
+        <w:t>El supervisor realiza la conciliación directa cruzando la data informada por el equipo de piso contra los registros teóricos en Odoo.</w:t>
+      </w:r>
+    </w:p>
+    <w:p>
+      <w:r>
+        <w:t>Verificación de Salidas y Cantidades en Reserva:</w:t>
+      </w:r>
+    </w:p>
+    <w:p>
+      <w:r>
+        <w:t>Auditoría minuciosa de las salidas pendientes por validar en el sistema.</w:t>
+      </w:r>
+    </w:p>
+    <w:p>
+      <w:r>
+        <w:t>Revisión de las cantidades marcadas en estado de "Reserva" en Odoo para identificar productos bloqueados, transferencias en borrador o compromisos de stock no despachados.</w:t>
+      </w:r>
+    </w:p>
+    <w:p>
+      <w:r>
+        <w:t>Optimizaciones de Espacio y Layout del Almacén PT:</w:t>
+      </w:r>
+    </w:p>
+    <w:p>
+      <w:r>
+        <w:t>Planteamiento de Mejoras: Evaluación del aprovechamiento del espacio físico para reestructurar zonas de almacenamiento PT, pasillos de tráfico y estanterías.</w:t>
+      </w:r>
+    </w:p>
+    <w:p>
+      <w:r>
+        <w:t>Identificación y Etiquetado: Control y supervisión de que cada anaquel, rack, caja o tramo cuente con su correcta señalización física y etiquetado claro.</w:t>
+      </w:r>
+    </w:p>
+    <w:p>
+      <w:r>
+        <w:t>Creación de Nuevas Ubicaciones en Sistema: Definición e ingreso en Odoo de las nuevas ubicaciones lógicas creadas en el almacén físico PT, garantizando la trazabilidad exacta de la mercancía.</w:t>
       </w:r>
     </w:p>
     <w:p>
@@ -119,295 +345,12 @@
         <w:pStyle w:val="Heading2"/>
       </w:pPr>
       <w:r>
-        <w:t>4. PROCEDIMIENTO DETALLADO PASO A PASO</w:t>
+        <w:t>4. MATRIZ DE ATRIBUCIONES: EJECUCIÓN DIRECTA VS. SUPERVISIÓN DE PISO</w:t>
       </w:r>
     </w:p>
     <w:p>
-      <w:pPr>
-        <w:pStyle w:val="Heading3"/>
-      </w:pPr>
       <w:r>
-        <w:t>FASE I: Planificación de OT, requerimientos de MP y desbloqueo de piso</w:t>
-      </w:r>
-    </w:p>
-    <w:p>
-      <w:pPr>
-        <w:pStyle w:val="ListBullet"/>
-      </w:pPr>
-      <w:r>
-        <w:t>Verificar que cada Orden de Trabajo (OT) en Odoo tenga trazos impresos (Audaces), variantes/SKU correctos y alineación con catálogo web (somoscuadro.com).</w:t>
-      </w:r>
-    </w:p>
-    <w:p>
-      <w:pPr>
-        <w:pStyle w:val="ListBullet"/>
-      </w:pPr>
-      <w:r>
-        <w:t>Confirmar que Producción/Diseño/Pedidos/Calidad hayan generado la solicitud formal de tela e insumos vinculada a la OT.</w:t>
-      </w:r>
-    </w:p>
-    <w:p>
-      <w:pPr>
-        <w:pStyle w:val="ListBullet"/>
-      </w:pPr>
-      <w:r>
-        <w:t>Coordinar con Supervisor de Logística (MP) el cálculo y entrega de tela según trazos; validar cantidades antes del picking en MP.</w:t>
-      </w:r>
-    </w:p>
-    <w:p>
-      <w:pPr>
-        <w:pStyle w:val="ListBullet"/>
-      </w:pPr>
-      <w:r>
-        <w:t>Control preventivo: frenar OT si se solicitan variantes inexistentes o colores fuera de producción activa; escalar a Diseño/Compras.</w:t>
-      </w:r>
-    </w:p>
-    <w:p>
-      <w:pPr>
-        <w:pStyle w:val="Heading3"/>
-      </w:pPr>
-      <w:r>
-        <w:t>FASE II: Recepción en piso de manufactura y trazabilidad Preproducción</w:t>
-      </w:r>
-    </w:p>
-    <w:p>
-      <w:pPr>
-        <w:pStyle w:val="ListBullet"/>
-      </w:pPr>
-      <w:r>
-        <w:t>Al recibir tela e insumos físicamente en piso, verificar coincidencia con picking list, SKU, lote y área destinataria.</w:t>
-      </w:r>
-    </w:p>
-    <w:p>
-      <w:pPr>
-        <w:pStyle w:val="ListBullet"/>
-      </w:pPr>
-      <w:r>
-        <w:t>Supervisar registro en Google Sheets MP (SKU, cantidad, área) y traslado en Odoo: OT + PC desde TH/Existencia MP hacia Preproducción (piso manufactura).</w:t>
-      </w:r>
-    </w:p>
-    <w:p>
-      <w:pPr>
-        <w:pStyle w:val="ListBullet"/>
-      </w:pPr>
-      <w:r>
-        <w:t>Auditar que el traslado por ola de tela (1.ª etapa manufactura) quede asociado a la OT correcta antes de iniciar corte/confección.</w:t>
-      </w:r>
-    </w:p>
-    <w:p>
-      <w:pPr>
-        <w:pStyle w:val="Heading3"/>
-      </w:pPr>
-      <w:r>
-        <w:t>FASE III: Ejecución en piso — Manufactura y control en proceso</w:t>
-      </w:r>
-    </w:p>
-    <w:p>
-      <w:pPr>
-        <w:pStyle w:val="ListBullet"/>
-      </w:pPr>
-      <w:r>
-        <w:t>Supervisar avance de OT por etapas en Odoo; asegurar que operadores reporten mermas, reprocesos y novedades antes de Validación.</w:t>
-      </w:r>
-    </w:p>
-    <w:p>
-      <w:pPr>
-        <w:pStyle w:val="ListBullet"/>
-      </w:pPr>
-      <w:r>
-        <w:t>Verificar estándares de etiquetado (hang tag, TPU, SENCAMER cuando aplique) y empaque intermedio según familia de producto.</w:t>
-      </w:r>
-    </w:p>
-    <w:p>
-      <w:pPr>
-        <w:pStyle w:val="ListBullet"/>
-      </w:pPr>
-      <w:r>
-        <w:t>Para equipamiento: controlar serialización, accesorios, manual/embalaje y ubicación física diferenciada de prendas manufacturadas.</w:t>
-      </w:r>
-    </w:p>
-    <w:p>
-      <w:pPr>
-        <w:pStyle w:val="ListBullet"/>
-      </w:pPr>
-      <w:r>
-        <w:t>Aplicar metodología 5S en zona PT/equipamiento: señalización, pasillos libres y clasificación por tipo (manufacturado vs equipamiento).</w:t>
-      </w:r>
-    </w:p>
-    <w:p>
-      <w:pPr>
-        <w:pStyle w:val="Heading3"/>
-      </w:pPr>
-      <w:r>
-        <w:t>FASE IV: Pre-Validación — Auditoría de MP consumida y contingencias ("Levantar la bandera")</w:t>
-      </w:r>
-    </w:p>
-    <w:p>
-      <w:pPr>
-        <w:pStyle w:val="ListBullet"/>
-      </w:pPr>
-      <w:r>
-        <w:t>Antes de la etapa Validación, cruzar insumos pendientes de descuento (hang tag, cinta TPU, tinta, cordones, etc.) vs existencia física y reservas Odoo.</w:t>
-      </w:r>
-    </w:p>
-    <w:p>
-      <w:pPr>
-        <w:pStyle w:val="ListBullet"/>
-      </w:pPr>
-      <w:r>
-        <w:t>Protocolo de alerta: si MP insuficiente o discrepancia en anaquel MP/Preproducción, detener validación de PT y reportar a Supervisor Logística.</w:t>
-      </w:r>
-    </w:p>
-    <w:p>
-      <w:pPr>
-        <w:pStyle w:val="ListBullet"/>
-      </w:pPr>
-      <w:r>
-        <w:t>Dictaminar reasignación prioritaria de insumos restantes por OT crítica (ventas, tiendas Tolón/Grand Plaz, Valencia matutino, etc.).</w:t>
-      </w:r>
-    </w:p>
-    <w:p>
-      <w:pPr>
-        <w:pStyle w:val="ListBullet"/>
-      </w:pPr>
-      <w:r>
-        <w:t>Validar formulario QA digital (cuando esté implementado) o hoja de soporte de recepción para lotes aún en TH/Por Auditar que bloqueen consumo.</w:t>
-      </w:r>
-    </w:p>
-    <w:p>
-      <w:pPr>
-        <w:pStyle w:val="Heading3"/>
-      </w:pPr>
-      <w:r>
-        <w:t>FASE V: Validación de manufactura e ingreso de Producto Terminado</w:t>
-      </w:r>
-    </w:p>
-    <w:p>
-      <w:pPr>
-        <w:pStyle w:val="ListBullet"/>
-      </w:pPr>
-      <w:r>
-        <w:t>En la última etapa de la OT (Validación), aprobar formalmente la Materia Prima consumida en Odoo — requisito obligatorio para validar PT.</w:t>
-      </w:r>
-    </w:p>
-    <w:p>
-      <w:pPr>
-        <w:pStyle w:val="ListBullet"/>
-      </w:pPr>
-      <w:r>
-        <w:t>Confirmar descuentos: tela ya descontada en 1.ª etapa; demás insumos al validar; cantidades coherentes con mermas registradas.</w:t>
-      </w:r>
-    </w:p>
-    <w:p>
-      <w:pPr>
-        <w:pStyle w:val="ListBullet"/>
-      </w:pPr>
-      <w:r>
-        <w:t>Validar la OT e ingresar PT a su ubicación teórica (stock PT manufacturado o sub-ubicación de equipamiento).</w:t>
-      </w:r>
-    </w:p>
-    <w:p>
-      <w:pPr>
-        <w:pStyle w:val="ListBullet"/>
-      </w:pPr>
-      <w:r>
-        <w:t>Verificación supervisoría SKU a SKU: cruce entre unidades físicas terminadas, etiquetas/códigos de barras y saldo Odoo post-validación.</w:t>
-      </w:r>
-    </w:p>
-    <w:p>
-      <w:pPr>
-        <w:pStyle w:val="ListBullet"/>
-      </w:pPr>
-      <w:r>
-        <w:t>Bloqueo: no validar PT si traslados internos de MP están en borrador, sin auditar o con diferencias QA sin resolver.</w:t>
-      </w:r>
-    </w:p>
-    <w:p>
-      <w:pPr>
-        <w:pStyle w:val="Heading3"/>
-      </w:pPr>
-      <w:r>
-        <w:t>FASE VI: Control de calidad en PT, empaque final y preparación para Logística</w:t>
-      </w:r>
-    </w:p>
-    <w:p>
-      <w:pPr>
-        <w:pStyle w:val="ListBullet"/>
-      </w:pPr>
-      <w:r>
-        <w:t>Inspección por muestreo: calidad de confección, etiquetas, empaque, integridad de equipamiento.</w:t>
-      </w:r>
-    </w:p>
-    <w:p>
-      <w:pPr>
-        <w:pStyle w:val="ListBullet"/>
-      </w:pPr>
-      <w:r>
-        <w:t>Estándares de embalaje alineados con Logística: bolsa separadora, prenda etiquetada, caja sin deformación, hablador único de tienda cuando aplique a despacho directo.</w:t>
-      </w:r>
-    </w:p>
-    <w:p>
-      <w:pPr>
-        <w:pStyle w:val="ListBullet"/>
-      </w:pPr>
-      <w:r>
-        <w:t>Separar stock PT apto para picking de tiendas vs cuarentena/reproceso; registrar novedades en Odoo o Sheets según procedimiento vigente.</w:t>
-      </w:r>
-    </w:p>
-    <w:p>
-      <w:pPr>
-        <w:pStyle w:val="ListBullet"/>
-      </w:pPr>
-      <w:r>
-        <w:t>Entregar a Supervisión de Logística e Inventarios el lote validado con documentación (transferencias, conteos) para reabastecimiento.</w:t>
-      </w:r>
-    </w:p>
-    <w:p>
-      <w:pPr>
-        <w:pStyle w:val="Heading3"/>
-      </w:pPr>
-      <w:r>
-        <w:t>FASE VII: Inventario cíclico PT, conciliación Odoo y layout</w:t>
-      </w:r>
-    </w:p>
-    <w:p>
-      <w:pPr>
-        <w:pStyle w:val="ListBullet"/>
-      </w:pPr>
-      <w:r>
-        <w:t>Ejecutar inventario cíclico por familias/zonas PT y equipamiento; conciliar conteo físico vs teórico Odoo.</w:t>
-      </w:r>
-    </w:p>
-    <w:p>
-      <w:pPr>
-        <w:pStyle w:val="ListBullet"/>
-      </w:pPr>
-      <w:r>
-        <w:t>Auditar cantidades en reserva, transferencias en borrador y salidas pendientes que bloqueen disponibilidad PT.</w:t>
-      </w:r>
-    </w:p>
-    <w:p>
-      <w:pPr>
-        <w:pStyle w:val="ListBullet"/>
-      </w:pPr>
-      <w:r>
-        <w:t>Optimizar layout: nuevas ubicaciones lógicas en Odoo reflejando racks PT/equipamiento; etiquetado físico auditado semanalmente.</w:t>
-      </w:r>
-    </w:p>
-    <w:p>
-      <w:pPr>
-        <w:pStyle w:val="ListBullet"/>
-      </w:pPr>
-      <w:r>
-        <w:t>Reportar desviaciones recurrentes (SKU fantasma, variantes web divergentes) a Diseño y Logística para corrección en origen.</w:t>
-      </w:r>
-    </w:p>
-    <w:p>
-      <w:pPr>
-        <w:pStyle w:val="Heading2"/>
-      </w:pPr>
-      <w:r>
-        <w:t>5. MATRIZ DE ATRIBUCIONES: EJECUCIÓN DIRECTA VS. SUPERVISIÓN DE PISO</w:t>
+        <w:t>Para mantener la claridad operativa dentro del Taller, se definen el rol directo y la delegación de tareas bajo la responsabilidad del Supervisor de Producto Terminado:</w:t>
       </w:r>
     </w:p>
     <w:tbl>
@@ -438,7 +381,7 @@
           </w:tcPr>
           <w:p>
             <w:r>
-              <w:t>Actividades que ejecuta directamente el Supervisor de PT</w:t>
+              <w:t>Actividades que Ejecuta Directamente el Supervisor de PT</w:t>
             </w:r>
           </w:p>
         </w:tc>
@@ -448,7 +391,7 @@
           </w:tcPr>
           <w:p>
             <w:r>
-              <w:t>Actividades que delega y supervisa (Operadores / Producción)</w:t>
+              <w:t>Actividades que Delega y Supervisa en el Equipo de Almacenistas</w:t>
             </w:r>
           </w:p>
         </w:tc>
@@ -460,7 +403,7 @@
           </w:tcPr>
           <w:p>
             <w:r>
-              <w:t>Planificación OT y SKUs</w:t>
+              <w:t>Validación de Fichas</w:t>
             </w:r>
           </w:p>
         </w:tc>
@@ -470,7 +413,7 @@
           </w:tcPr>
           <w:p>
             <w:r>
-              <w:t>Cruce OT vs catálogo Odoo/Web; autorización de inicio; escalamiento de variantes inválidas.</w:t>
+              <w:t>Cruce de requerimientos vs. Catálogo Maestro Odoo / Web (somoscuadro.com).</w:t>
             </w:r>
           </w:p>
         </w:tc>
@@ -480,7 +423,7 @@
           </w:tcPr>
           <w:p>
             <w:r>
-              <w:t>Ejecución de corte/confección/acabado según OT.</w:t>
+              <w:t>N/A (Función exclusiva de supervisión).</w:t>
             </w:r>
           </w:p>
         </w:tc>
@@ -492,7 +435,7 @@
           </w:tcPr>
           <w:p>
             <w:r>
-              <w:t>Trazabilidad MP en manufactura</w:t>
+              <w:t>Picking y Recolección</w:t>
             </w:r>
           </w:p>
         </w:tc>
@@ -502,7 +445,7 @@
           </w:tcPr>
           <w:p>
             <w:r>
-              <w:t>Auditoría de traslados OT+PC; confirmación traslado por ola de tela; pre-validación de insumos.</w:t>
+              <w:t>Verificación y atajada final de discrepancias de SKUs al terminar la recolección</w:t>
             </w:r>
           </w:p>
         </w:tc>
@@ -512,7 +455,7 @@
           </w:tcPr>
           <w:p>
             <w:r>
-              <w:t>Recepción física MP en piso; registro Sheets; picking devuelto a MP.</w:t>
+              <w:t>Recorrido en piso y lectura unitaria (1 a 1) con pistola escáner.</w:t>
             </w:r>
           </w:p>
         </w:tc>
@@ -524,7 +467,7 @@
           </w:tcPr>
           <w:p>
             <w:r>
-              <w:t>Validación e ingreso PT</w:t>
+              <w:t>Atención a Contingencias</w:t>
             </w:r>
           </w:p>
         </w:tc>
@@ -534,7 +477,7 @@
           </w:tcPr>
           <w:p>
             <w:r>
-              <w:t>Aprobación MP consumida; validación OT; ingreso a ubicación teórica; cruce SKU final.</w:t>
+              <w:t>Toma de decisión sobre reasignación de productos en baja existencia ("Banderas")</w:t>
             </w:r>
           </w:p>
         </w:tc>
@@ -544,7 +487,7 @@
           </w:tcPr>
           <w:p>
             <w:r>
-              <w:t>Conteo y presentación de unidades terminadas; etiquetado inicial.</w:t>
+              <w:t>Detección y reporte inmediato de baja existencia en anaquel.</w:t>
             </w:r>
           </w:p>
         </w:tc>
@@ -556,7 +499,7 @@
           </w:tcPr>
           <w:p>
             <w:r>
-              <w:t>Contingencias / Banderas</w:t>
+              <w:t>Calidad y Embalaje</w:t>
             </w:r>
           </w:p>
         </w:tc>
@@ -566,7 +509,7 @@
           </w:tcPr>
           <w:p>
             <w:r>
-              <w:t>Decisión de priorización OT y reasignación de insumos; comunicación con Logística.</w:t>
+              <w:t>Inspección por muestreo de bolsas internas, habladores únicos y código SENCAMER.</w:t>
             </w:r>
           </w:p>
         </w:tc>
@@ -576,7 +519,7 @@
           </w:tcPr>
           <w:p>
             <w:r>
-              <w:t>Reporte inmediato de faltantes en anaquel o discrepancias.</w:t>
+              <w:t>Colocación de bolsas protectoras, doblado, empaque y sellado de cajas.</w:t>
             </w:r>
           </w:p>
         </w:tc>
@@ -588,7 +531,7 @@
           </w:tcPr>
           <w:p>
             <w:r>
-              <w:t>Calidad PT y equipamiento</w:t>
+              <w:t>Control Documental</w:t>
             </w:r>
           </w:p>
         </w:tc>
@@ -598,7 +541,7 @@
           </w:tcPr>
           <w:p>
             <w:r>
-              <w:t>Inspección por muestreo; liberación o cuarentena; criterios SENCAMER/equipamiento.</w:t>
+              <w:t>Emisión de Notas de Entrega, verificación transferencia por transferencia y entrega a Operaciones.</w:t>
             </w:r>
           </w:p>
         </w:tc>
@@ -608,7 +551,7 @@
           </w:tcPr>
           <w:p>
             <w:r>
-              <w:t>Empaque, doblado, armado de kits de equipamiento.</w:t>
+              <w:t>Apilamiento y orden de cajas por tienda en la zona de acopio.</w:t>
             </w:r>
           </w:p>
         </w:tc>
@@ -620,7 +563,7 @@
           </w:tcPr>
           <w:p>
             <w:r>
-              <w:t>Interfaz con Despacho tiendas</w:t>
+              <w:t>Inventario Cíclico</w:t>
             </w:r>
           </w:p>
         </w:tc>
@@ -630,7 +573,7 @@
           </w:tcPr>
           <w:p>
             <w:r>
-              <w:t>Confirmación de stock PT disponible; priorización de OT para surtido crítico.</w:t>
+              <w:t>Conciliación en Odoo vs. Conteo físico, auditoría de reservas y salidas.</w:t>
             </w:r>
           </w:p>
         </w:tc>
@@ -640,7 +583,7 @@
           </w:tcPr>
           <w:p>
             <w:r>
-              <w:t>Picking unitario y empaque final (bajo supervisión Logística).</w:t>
+              <w:t>Ejecución del conteo ciego en piso de las ubicaciones asignadas.</w:t>
             </w:r>
           </w:p>
         </w:tc>
@@ -652,7 +595,7 @@
           </w:tcPr>
           <w:p>
             <w:r>
-              <w:t>Inventario cíclico PT</w:t>
+              <w:t>Layout y Ubicaciones</w:t>
             </w:r>
           </w:p>
         </w:tc>
@@ -662,7 +605,7 @@
           </w:tcPr>
           <w:p>
             <w:r>
-              <w:t>Conciliación Odoo vs físico; auditoría de reservas; altas de ubicaciones.</w:t>
+              <w:t>Planteamiento de mejora de espacios y creación/alta de nuevas ubicaciones lógicas en Odoo PT.</w:t>
             </w:r>
           </w:p>
         </w:tc>
@@ -672,7 +615,7 @@
           </w:tcPr>
           <w:p>
             <w:r>
-              <w:t>Conteo ciego en ubicaciones asignadas; orden 5S en zona.</w:t>
+              <w:t>Pegado de etiquetas físicas en estantes, organización y limpieza de espacios.</w:t>
             </w:r>
           </w:p>
         </w:tc>
@@ -683,116 +626,12 @@
         <w:pStyle w:val="Heading2"/>
       </w:pPr>
       <w:r>
-        <w:t>6. REGISTROS, SISTEMAS Y SOPORTES</w:t>
-      </w:r>
-    </w:p>
-    <w:p>
-      <w:pPr>
-        <w:pStyle w:val="ListBullet"/>
-      </w:pPr>
-      <w:r>
-        <w:t>Odoo: OT de manufactura, traslados internos, PC, validación PT, ubicaciones teóricas, reservas y transferencias a tiendas.</w:t>
-      </w:r>
-    </w:p>
-    <w:p>
-      <w:pPr>
-        <w:pStyle w:val="ListBullet"/>
-      </w:pPr>
-      <w:r>
-        <w:t>Audaces: trazos/tizadas para cálculo de tela.</w:t>
-      </w:r>
-    </w:p>
-    <w:p>
-      <w:pPr>
-        <w:pStyle w:val="ListBullet"/>
-      </w:pPr>
-      <w:r>
-        <w:t>Google Sheets MP: control de entregas y devoluciones de tela/insumos.</w:t>
-      </w:r>
-    </w:p>
-    <w:p>
-      <w:pPr>
-        <w:pStyle w:val="ListBullet"/>
-      </w:pPr>
-      <w:r>
-        <w:t>Matriz de reabastecimiento tiendas (Google Sheets) — interfaz con Logística post-PT.</w:t>
-      </w:r>
-    </w:p>
-    <w:p>
-      <w:pPr>
-        <w:pStyle w:val="ListBullet"/>
-      </w:pPr>
-      <w:r>
-        <w:t>Hoja soporte recepción QA / formulario digital QA (evolución planificada).</w:t>
-      </w:r>
-    </w:p>
-    <w:p>
-      <w:pPr>
-        <w:pStyle w:val="ListBullet"/>
-      </w:pPr>
-      <w:r>
-        <w:t>Checklist 5S — auditoría semanal zona PT/equipamiento.</w:t>
-      </w:r>
-    </w:p>
-    <w:p>
-      <w:pPr>
-        <w:pStyle w:val="Heading2"/>
-      </w:pPr>
-      <w:r>
-        <w:t>7. INDICADORES Y CONTROLES SUPERVISORIOS</w:t>
-      </w:r>
-    </w:p>
-    <w:p>
-      <w:pPr>
-        <w:pStyle w:val="ListBullet"/>
-      </w:pPr>
-      <w:r>
-        <w:t>OT en Validación pendientes de aprobación MP (meta: cero bloqueos por MP &gt; 24 h).</w:t>
-      </w:r>
-    </w:p>
-    <w:p>
-      <w:pPr>
-        <w:pStyle w:val="ListBullet"/>
-      </w:pPr>
-      <w:r>
-        <w:t>Diferencias inventario cíclico PT (% por familia).</w:t>
-      </w:r>
-    </w:p>
-    <w:p>
-      <w:pPr>
-        <w:pStyle w:val="ListBullet"/>
-      </w:pPr>
-      <w:r>
-        <w:t>Tiempo OT cierre: fin confección → validación PT en Odoo.</w:t>
-      </w:r>
-    </w:p>
-    <w:p>
-      <w:pPr>
-        <w:pStyle w:val="ListBullet"/>
-      </w:pPr>
-      <w:r>
-        <w:t>Incidencias SKU/variante incorrecta detectadas en pre-validación.</w:t>
-      </w:r>
-    </w:p>
-    <w:p>
-      <w:pPr>
-        <w:pStyle w:val="ListBullet"/>
-      </w:pPr>
-      <w:r>
-        <w:t>Stock PT disponible vs solicitudes críticas de tienda (Tolón/Grand Plaz, Valencia AM).</w:t>
-      </w:r>
-    </w:p>
-    <w:p>
-      <w:pPr>
-        <w:pStyle w:val="Heading2"/>
-      </w:pPr>
-      <w:r>
-        <w:t>8. DIAGRAMA / RESUMEN DEL FLUJO OPERATIVO Y DOCUMENTAL</w:t>
+        <w:t>5. DIAGRAMA / RESUMEN DEL FLUJO OPERATIVO Y DOCUMENTAL</w:t>
       </w:r>
     </w:p>
     <w:p>
       <w:r>
-        <w:t>[Requisición Compra → Recepción QA → MP en Odoo]</w:t>
+        <w:t>[Solicitud Tiendas (Sheets)]</w:t>
       </w:r>
     </w:p>
     <w:p>
@@ -807,7 +646,7 @@
     </w:p>
     <w:p>
       <w:r>
-        <w:t>[Solicitud OT + Trazos Audaces → Despacho MP a Preproducción]</w:t>
+        <w:t>[Verificación de Variantes en Odoo/Web (Supervisor PT)]</w:t>
       </w:r>
     </w:p>
     <w:p>
@@ -822,7 +661,7 @@
     </w:p>
     <w:p>
       <w:r>
-        <w:t>[1.ª Etapa Manufactura: Traslado por ola — descuento TELA]</w:t>
+        <w:t>[Impresión de Listas de Picking]</w:t>
       </w:r>
     </w:p>
     <w:p>
@@ -837,7 +676,7 @@
     </w:p>
     <w:p>
       <w:r>
-        <w:t>[Ejecución en piso — Confección / Equipamiento]</w:t>
+        <w:t>[Priorización: 1. Tolón/Grand Plaz | 2. Valencia | 3. Resto]</w:t>
       </w:r>
     </w:p>
     <w:p>
@@ -852,7 +691,7 @@
     </w:p>
     <w:p>
       <w:r>
-        <w:t>[Pre-Validación PT: cruce insumos + MP física vs Odoo]</w:t>
+        <w:t>[Picking Unitario 1 a 1 con Pistola (Almacenistas)]</w:t>
       </w:r>
     </w:p>
     <w:p>
@@ -867,7 +706,7 @@
     </w:p>
     <w:p>
       <w:r>
-        <w:t>[Validación Manufactura: Aprobar MP consumida + Validar PT]</w:t>
+        <w:t>[Verificación de SKUs y Discrepancias (Supervisor PT)]</w:t>
       </w:r>
     </w:p>
     <w:p>
@@ -882,7 +721,7 @@
     </w:p>
     <w:p>
       <w:r>
-        <w:t>[Ingreso PT → Ubicación teórica Odoo]</w:t>
+        <w:t>[Embalaje: Bolsa Interna + Hablador Único + SENCAMER]</w:t>
       </w:r>
     </w:p>
     <w:p>
@@ -897,7 +736,7 @@
     </w:p>
     <w:p>
       <w:r>
-        <w:t>[QA PT / Empaque] ──► [Entrega a Logística — Reabastecimiento tiendas]</w:t>
+        <w:t>[Verificación Transferencia por Transferencia + Impresión Notas de Entrega]</w:t>
       </w:r>
     </w:p>
     <w:p>
@@ -907,55 +746,27 @@
     </w:p>
     <w:p>
       <w:r>
-        <w:t xml:space="preserve">           └──► [Inventario cíclico PT / Layout / Conciliación semanal]</w:t>
+        <w:t xml:space="preserve">           ▼</w:t>
       </w:r>
     </w:p>
     <w:p>
-      <w:pPr>
-        <w:pStyle w:val="Heading2"/>
-      </w:pPr>
       <w:r>
-        <w:t>9. MEJORAS PLANIFICADAS (ALINEADAS AL MANUAL LOGÍSTICA)</w:t>
+        <w:t>[Conteo de Cajas y Entrega Formal a Operaciones]</w:t>
       </w:r>
     </w:p>
     <w:p>
-      <w:pPr>
-        <w:pStyle w:val="ListBullet"/>
-      </w:pPr>
       <w:r>
-        <w:t>Automatizar formulario QA digital y generación de traslados internos post-recepción (Supervisor audita y confirma).</w:t>
+        <w:t xml:space="preserve">           │</w:t>
       </w:r>
     </w:p>
     <w:p>
-      <w:pPr>
-        <w:pStyle w:val="ListBullet"/>
-      </w:pPr>
       <w:r>
-        <w:t>Alertas automáticas por rechazo QA o diferencias kg/metros.</w:t>
+        <w:t xml:space="preserve">           ▼</w:t>
       </w:r>
     </w:p>
     <w:p>
-      <w:pPr>
-        <w:pStyle w:val="ListBullet"/>
-      </w:pPr>
       <w:r>
-        <w:t>Etiquetas código de barras/QR en PT desde Odoo para escaneo en validación y despacho.</w:t>
-      </w:r>
-    </w:p>
-    <w:p>
-      <w:pPr>
-        <w:pStyle w:val="ListBullet"/>
-      </w:pPr>
-      <w:r>
-        <w:t>Reglas de reorden por stock mínimo que alimenten producción sin bloquear Validación.</w:t>
-      </w:r>
-    </w:p>
-    <w:p>
-      <w:r/>
-    </w:p>
-    <w:p>
-      <w:r>
-        <w:t>Documento elaborado a partir del Manual de Procesos Logística e Inventarios (dashboard HTML) y estructura SOP Somos Cuadro. Versión: 1.0 — Septiembre 2026.</w:t>
+        <w:t>[Carga de Camión (Día Anterior)] ──► [Auditoría Cíclica / Conciliación Odoo / Layout Semanal]</w:t>
       </w:r>
     </w:p>
     <w:sectPr>

</xml_diff>